<commit_message>
Adding the Statistics notes
</commit_message>
<xml_diff>
--- a/Statistics-And-Statistical-Analysis/Statistics-Notes-01.docx
+++ b/Statistics-And-Statistical-Analysis/Statistics-Notes-01.docx
@@ -680,12 +680,825 @@
     </w:p>
     <w:p>
       <w:pPr>
-        <w:rPr>
-          <w:rFonts w:ascii="Sakkal Majalla" w:hAnsi="Sakkal Majalla" w:cs="Sakkal Majalla"/>
-          <w:sz w:val="28"/>
-          <w:szCs w:val="28"/>
-        </w:rPr>
-      </w:pPr>
+        <w:jc w:val="center"/>
+        <w:rPr>
+          <w:rFonts w:ascii="Sakkal Majalla" w:hAnsi="Sakkal Majalla" w:cs="Sakkal Majalla"/>
+          <w:sz w:val="28"/>
+          <w:szCs w:val="28"/>
+        </w:rPr>
+      </w:pPr>
+      <w:r>
+        <w:rPr>
+          <w:noProof/>
+        </w:rPr>
+        <w:lastRenderedPageBreak/>
+        <w:drawing>
+          <wp:inline distT="0" distB="0" distL="0" distR="0" wp14:anchorId="4ECD5B26" wp14:editId="372E9447">
+            <wp:extent cx="3038475" cy="2495550"/>
+            <wp:effectExtent l="0" t="0" r="9525" b="0"/>
+            <wp:docPr id="390050079" name="Picture 1"/>
+            <wp:cNvGraphicFramePr>
+              <a:graphicFrameLocks xmlns:a="http://schemas.openxmlformats.org/drawingml/2006/main" noChangeAspect="1"/>
+            </wp:cNvGraphicFramePr>
+            <a:graphic xmlns:a="http://schemas.openxmlformats.org/drawingml/2006/main">
+              <a:graphicData uri="http://schemas.openxmlformats.org/drawingml/2006/picture">
+                <pic:pic xmlns:pic="http://schemas.openxmlformats.org/drawingml/2006/picture">
+                  <pic:nvPicPr>
+                    <pic:cNvPr id="390050079" name=""/>
+                    <pic:cNvPicPr/>
+                  </pic:nvPicPr>
+                  <pic:blipFill>
+                    <a:blip r:embed="rId11"/>
+                    <a:stretch>
+                      <a:fillRect/>
+                    </a:stretch>
+                  </pic:blipFill>
+                  <pic:spPr>
+                    <a:xfrm>
+                      <a:off x="0" y="0"/>
+                      <a:ext cx="3038475" cy="2495550"/>
+                    </a:xfrm>
+                    <a:prstGeom prst="rect">
+                      <a:avLst/>
+                    </a:prstGeom>
+                  </pic:spPr>
+                </pic:pic>
+              </a:graphicData>
+            </a:graphic>
+          </wp:inline>
+        </w:drawing>
+      </w:r>
+    </w:p>
+    <w:p>
+      <w:pPr>
+        <w:ind w:left="720" w:firstLine="720"/>
+        <w:rPr>
+          <w:rFonts w:ascii="Sakkal Majalla" w:hAnsi="Sakkal Majalla" w:cs="Sakkal Majalla"/>
+          <w:sz w:val="28"/>
+          <w:szCs w:val="28"/>
+        </w:rPr>
+      </w:pPr>
+      <w:r>
+        <w:rPr>
+          <w:rFonts w:ascii="Sakkal Majalla" w:hAnsi="Sakkal Majalla" w:cs="Sakkal Majalla"/>
+          <w:sz w:val="28"/>
+          <w:szCs w:val="28"/>
+        </w:rPr>
+        <w:t>***********************************************************************</w:t>
+      </w:r>
+    </w:p>
+    <w:p>
+      <w:pPr>
+        <w:rPr>
+          <w:rFonts w:ascii="Sakkal Majalla" w:hAnsi="Sakkal Majalla" w:cs="Sakkal Majalla"/>
+          <w:sz w:val="28"/>
+          <w:szCs w:val="28"/>
+        </w:rPr>
+      </w:pPr>
+      <w:r>
+        <w:rPr>
+          <w:noProof/>
+        </w:rPr>
+        <w:drawing>
+          <wp:inline distT="0" distB="0" distL="0" distR="0" wp14:anchorId="33AD45DE" wp14:editId="195E1EEE">
+            <wp:extent cx="4048125" cy="419100"/>
+            <wp:effectExtent l="0" t="0" r="9525" b="0"/>
+            <wp:docPr id="1193003533" name="Picture 1"/>
+            <wp:cNvGraphicFramePr>
+              <a:graphicFrameLocks xmlns:a="http://schemas.openxmlformats.org/drawingml/2006/main" noChangeAspect="1"/>
+            </wp:cNvGraphicFramePr>
+            <a:graphic xmlns:a="http://schemas.openxmlformats.org/drawingml/2006/main">
+              <a:graphicData uri="http://schemas.openxmlformats.org/drawingml/2006/picture">
+                <pic:pic xmlns:pic="http://schemas.openxmlformats.org/drawingml/2006/picture">
+                  <pic:nvPicPr>
+                    <pic:cNvPr id="1193003533" name=""/>
+                    <pic:cNvPicPr/>
+                  </pic:nvPicPr>
+                  <pic:blipFill>
+                    <a:blip r:embed="rId12"/>
+                    <a:stretch>
+                      <a:fillRect/>
+                    </a:stretch>
+                  </pic:blipFill>
+                  <pic:spPr>
+                    <a:xfrm>
+                      <a:off x="0" y="0"/>
+                      <a:ext cx="4048125" cy="419100"/>
+                    </a:xfrm>
+                    <a:prstGeom prst="rect">
+                      <a:avLst/>
+                    </a:prstGeom>
+                  </pic:spPr>
+                </pic:pic>
+              </a:graphicData>
+            </a:graphic>
+          </wp:inline>
+        </w:drawing>
+      </w:r>
+    </w:p>
+    <w:p>
+      <w:pPr>
+        <w:rPr>
+          <w:rFonts w:ascii="Sakkal Majalla" w:hAnsi="Sakkal Majalla" w:cs="Sakkal Majalla"/>
+          <w:sz w:val="28"/>
+          <w:szCs w:val="28"/>
+        </w:rPr>
+      </w:pPr>
+      <w:r>
+        <w:rPr>
+          <w:noProof/>
+        </w:rPr>
+        <w:drawing>
+          <wp:inline distT="0" distB="0" distL="0" distR="0" wp14:anchorId="06654C78" wp14:editId="77334F1D">
+            <wp:extent cx="5057775" cy="390525"/>
+            <wp:effectExtent l="0" t="0" r="9525" b="9525"/>
+            <wp:docPr id="1838784324" name="Picture 1"/>
+            <wp:cNvGraphicFramePr>
+              <a:graphicFrameLocks xmlns:a="http://schemas.openxmlformats.org/drawingml/2006/main" noChangeAspect="1"/>
+            </wp:cNvGraphicFramePr>
+            <a:graphic xmlns:a="http://schemas.openxmlformats.org/drawingml/2006/main">
+              <a:graphicData uri="http://schemas.openxmlformats.org/drawingml/2006/picture">
+                <pic:pic xmlns:pic="http://schemas.openxmlformats.org/drawingml/2006/picture">
+                  <pic:nvPicPr>
+                    <pic:cNvPr id="1838784324" name=""/>
+                    <pic:cNvPicPr/>
+                  </pic:nvPicPr>
+                  <pic:blipFill>
+                    <a:blip r:embed="rId13"/>
+                    <a:stretch>
+                      <a:fillRect/>
+                    </a:stretch>
+                  </pic:blipFill>
+                  <pic:spPr>
+                    <a:xfrm>
+                      <a:off x="0" y="0"/>
+                      <a:ext cx="5057775" cy="390525"/>
+                    </a:xfrm>
+                    <a:prstGeom prst="rect">
+                      <a:avLst/>
+                    </a:prstGeom>
+                  </pic:spPr>
+                </pic:pic>
+              </a:graphicData>
+            </a:graphic>
+          </wp:inline>
+        </w:drawing>
+      </w:r>
+    </w:p>
+    <w:p>
+      <w:pPr>
+        <w:rPr>
+          <w:rFonts w:ascii="Sakkal Majalla" w:hAnsi="Sakkal Majalla" w:cs="Sakkal Majalla"/>
+          <w:sz w:val="28"/>
+          <w:szCs w:val="28"/>
+        </w:rPr>
+      </w:pPr>
+      <w:r>
+        <w:rPr>
+          <w:noProof/>
+        </w:rPr>
+        <w:drawing>
+          <wp:inline distT="0" distB="0" distL="0" distR="0" wp14:anchorId="50965769" wp14:editId="32A43D0C">
+            <wp:extent cx="3514725" cy="809625"/>
+            <wp:effectExtent l="0" t="0" r="9525" b="9525"/>
+            <wp:docPr id="1831155575" name="Picture 1"/>
+            <wp:cNvGraphicFramePr>
+              <a:graphicFrameLocks xmlns:a="http://schemas.openxmlformats.org/drawingml/2006/main" noChangeAspect="1"/>
+            </wp:cNvGraphicFramePr>
+            <a:graphic xmlns:a="http://schemas.openxmlformats.org/drawingml/2006/main">
+              <a:graphicData uri="http://schemas.openxmlformats.org/drawingml/2006/picture">
+                <pic:pic xmlns:pic="http://schemas.openxmlformats.org/drawingml/2006/picture">
+                  <pic:nvPicPr>
+                    <pic:cNvPr id="1831155575" name=""/>
+                    <pic:cNvPicPr/>
+                  </pic:nvPicPr>
+                  <pic:blipFill>
+                    <a:blip r:embed="rId14"/>
+                    <a:stretch>
+                      <a:fillRect/>
+                    </a:stretch>
+                  </pic:blipFill>
+                  <pic:spPr>
+                    <a:xfrm>
+                      <a:off x="0" y="0"/>
+                      <a:ext cx="3514725" cy="809625"/>
+                    </a:xfrm>
+                    <a:prstGeom prst="rect">
+                      <a:avLst/>
+                    </a:prstGeom>
+                  </pic:spPr>
+                </pic:pic>
+              </a:graphicData>
+            </a:graphic>
+          </wp:inline>
+        </w:drawing>
+      </w:r>
+    </w:p>
+    <w:p>
+      <w:pPr>
+        <w:rPr>
+          <w:rFonts w:ascii="Sakkal Majalla" w:hAnsi="Sakkal Majalla" w:cs="Sakkal Majalla"/>
+          <w:sz w:val="28"/>
+          <w:szCs w:val="28"/>
+        </w:rPr>
+      </w:pPr>
+      <w:r>
+        <w:rPr>
+          <w:noProof/>
+        </w:rPr>
+        <w:drawing>
+          <wp:inline distT="0" distB="0" distL="0" distR="0" wp14:anchorId="7A9DEAA4" wp14:editId="173F7C62">
+            <wp:extent cx="3152775" cy="1781175"/>
+            <wp:effectExtent l="0" t="0" r="9525" b="9525"/>
+            <wp:docPr id="679217415" name="Picture 1"/>
+            <wp:cNvGraphicFramePr>
+              <a:graphicFrameLocks xmlns:a="http://schemas.openxmlformats.org/drawingml/2006/main" noChangeAspect="1"/>
+            </wp:cNvGraphicFramePr>
+            <a:graphic xmlns:a="http://schemas.openxmlformats.org/drawingml/2006/main">
+              <a:graphicData uri="http://schemas.openxmlformats.org/drawingml/2006/picture">
+                <pic:pic xmlns:pic="http://schemas.openxmlformats.org/drawingml/2006/picture">
+                  <pic:nvPicPr>
+                    <pic:cNvPr id="679217415" name=""/>
+                    <pic:cNvPicPr/>
+                  </pic:nvPicPr>
+                  <pic:blipFill>
+                    <a:blip r:embed="rId15"/>
+                    <a:stretch>
+                      <a:fillRect/>
+                    </a:stretch>
+                  </pic:blipFill>
+                  <pic:spPr>
+                    <a:xfrm>
+                      <a:off x="0" y="0"/>
+                      <a:ext cx="3152775" cy="1781175"/>
+                    </a:xfrm>
+                    <a:prstGeom prst="rect">
+                      <a:avLst/>
+                    </a:prstGeom>
+                  </pic:spPr>
+                </pic:pic>
+              </a:graphicData>
+            </a:graphic>
+          </wp:inline>
+        </w:drawing>
+      </w:r>
+    </w:p>
+    <w:p>
+      <w:pPr>
+        <w:rPr>
+          <w:rFonts w:ascii="Sakkal Majalla" w:hAnsi="Sakkal Majalla" w:cs="Sakkal Majalla"/>
+          <w:sz w:val="28"/>
+          <w:szCs w:val="28"/>
+        </w:rPr>
+      </w:pPr>
+      <w:r>
+        <w:rPr>
+          <w:rFonts w:ascii="Sakkal Majalla" w:hAnsi="Sakkal Majalla" w:cs="Sakkal Majalla"/>
+          <w:sz w:val="28"/>
+          <w:szCs w:val="28"/>
+        </w:rPr>
+        <w:t xml:space="preserve">The </w:t>
+      </w:r>
+      <w:r>
+        <w:rPr>
+          <w:rFonts w:ascii="Sakkal Majalla" w:hAnsi="Sakkal Majalla" w:cs="Sakkal Majalla"/>
+          <w:b/>
+          <w:bCs/>
+          <w:color w:val="538135" w:themeColor="accent6" w:themeShade="BF"/>
+          <w:sz w:val="28"/>
+          <w:szCs w:val="28"/>
+        </w:rPr>
+        <w:t>height of the bar</w:t>
+      </w:r>
+      <w:r>
+        <w:rPr>
+          <w:rFonts w:ascii="Sakkal Majalla" w:hAnsi="Sakkal Majalla" w:cs="Sakkal Majalla"/>
+          <w:color w:val="538135" w:themeColor="accent6" w:themeShade="BF"/>
+          <w:sz w:val="28"/>
+          <w:szCs w:val="28"/>
+        </w:rPr>
+        <w:t xml:space="preserve"> </w:t>
+      </w:r>
+      <w:r>
+        <w:rPr>
+          <w:rFonts w:ascii="Sakkal Majalla" w:hAnsi="Sakkal Majalla" w:cs="Sakkal Majalla"/>
+          <w:sz w:val="28"/>
+          <w:szCs w:val="28"/>
+        </w:rPr>
+        <w:t xml:space="preserve">is used to measure </w:t>
+      </w:r>
+      <w:r>
+        <w:rPr>
+          <w:rFonts w:ascii="Sakkal Majalla" w:hAnsi="Sakkal Majalla" w:cs="Sakkal Majalla"/>
+          <w:b/>
+          <w:bCs/>
+          <w:color w:val="538135" w:themeColor="accent6" w:themeShade="BF"/>
+          <w:sz w:val="28"/>
+          <w:szCs w:val="28"/>
+        </w:rPr>
+        <w:t>how concentrated the frequency is for a particular group</w:t>
+      </w:r>
+      <w:r>
+        <w:rPr>
+          <w:rFonts w:ascii="Sakkal Majalla" w:hAnsi="Sakkal Majalla" w:cs="Sakkal Majalla"/>
+          <w:sz w:val="28"/>
+          <w:szCs w:val="28"/>
+        </w:rPr>
+        <w:t xml:space="preserve">. It’s a way of measuring how densely packed the frequency is, a way of saying how thick or thin on the ground the numbers are. The height of the bar </w:t>
+      </w:r>
+      <w:r>
+        <w:rPr>
+          <w:rFonts w:ascii="Sakkal Majalla" w:hAnsi="Sakkal Majalla" w:cs="Sakkal Majalla"/>
+          <w:b/>
+          <w:bCs/>
+          <w:color w:val="538135" w:themeColor="accent6" w:themeShade="BF"/>
+          <w:sz w:val="28"/>
+          <w:szCs w:val="28"/>
+        </w:rPr>
+        <w:t>is called the frequency density</w:t>
+      </w:r>
+      <w:r>
+        <w:rPr>
+          <w:rFonts w:ascii="Sakkal Majalla" w:hAnsi="Sakkal Majalla" w:cs="Sakkal Majalla"/>
+          <w:sz w:val="28"/>
+          <w:szCs w:val="28"/>
+        </w:rPr>
+        <w:t>.</w:t>
+      </w:r>
+    </w:p>
+    <w:p>
+      <w:pPr>
+        <w:ind w:left="720" w:firstLine="720"/>
+        <w:rPr>
+          <w:rFonts w:ascii="Sakkal Majalla" w:hAnsi="Sakkal Majalla" w:cs="Sakkal Majalla"/>
+          <w:sz w:val="28"/>
+          <w:szCs w:val="28"/>
+        </w:rPr>
+      </w:pPr>
+      <w:r>
+        <w:rPr>
+          <w:rFonts w:ascii="Sakkal Majalla" w:hAnsi="Sakkal Majalla" w:cs="Sakkal Majalla"/>
+          <w:sz w:val="28"/>
+          <w:szCs w:val="28"/>
+        </w:rPr>
+        <w:t>***********************************************************************</w:t>
+      </w:r>
+    </w:p>
+    <w:p>
+      <w:pPr>
+        <w:rPr>
+          <w:rFonts w:ascii="Sakkal Majalla" w:hAnsi="Sakkal Majalla" w:cs="Sakkal Majalla"/>
+          <w:sz w:val="28"/>
+          <w:szCs w:val="28"/>
+        </w:rPr>
+      </w:pPr>
+      <w:r>
+        <w:rPr>
+          <w:noProof/>
+        </w:rPr>
+        <w:lastRenderedPageBreak/>
+        <w:drawing>
+          <wp:inline distT="0" distB="0" distL="0" distR="0" wp14:anchorId="2563AC39" wp14:editId="0F7106BF">
+            <wp:extent cx="5943600" cy="2085340"/>
+            <wp:effectExtent l="0" t="0" r="0" b="0"/>
+            <wp:docPr id="298441853" name="Picture 1"/>
+            <wp:cNvGraphicFramePr>
+              <a:graphicFrameLocks xmlns:a="http://schemas.openxmlformats.org/drawingml/2006/main" noChangeAspect="1"/>
+            </wp:cNvGraphicFramePr>
+            <a:graphic xmlns:a="http://schemas.openxmlformats.org/drawingml/2006/main">
+              <a:graphicData uri="http://schemas.openxmlformats.org/drawingml/2006/picture">
+                <pic:pic xmlns:pic="http://schemas.openxmlformats.org/drawingml/2006/picture">
+                  <pic:nvPicPr>
+                    <pic:cNvPr id="298441853" name=""/>
+                    <pic:cNvPicPr/>
+                  </pic:nvPicPr>
+                  <pic:blipFill>
+                    <a:blip r:embed="rId16"/>
+                    <a:stretch>
+                      <a:fillRect/>
+                    </a:stretch>
+                  </pic:blipFill>
+                  <pic:spPr>
+                    <a:xfrm>
+                      <a:off x="0" y="0"/>
+                      <a:ext cx="5943600" cy="2085340"/>
+                    </a:xfrm>
+                    <a:prstGeom prst="rect">
+                      <a:avLst/>
+                    </a:prstGeom>
+                  </pic:spPr>
+                </pic:pic>
+              </a:graphicData>
+            </a:graphic>
+          </wp:inline>
+        </w:drawing>
+      </w:r>
+    </w:p>
+    <w:p>
+      <w:pPr>
+        <w:ind w:left="720" w:firstLine="720"/>
+        <w:rPr>
+          <w:rFonts w:ascii="Sakkal Majalla" w:hAnsi="Sakkal Majalla" w:cs="Sakkal Majalla"/>
+          <w:sz w:val="28"/>
+          <w:szCs w:val="28"/>
+        </w:rPr>
+      </w:pPr>
+      <w:r>
+        <w:rPr>
+          <w:rFonts w:ascii="Sakkal Majalla" w:hAnsi="Sakkal Majalla" w:cs="Sakkal Majalla"/>
+          <w:sz w:val="28"/>
+          <w:szCs w:val="28"/>
+        </w:rPr>
+        <w:t>***********************************************************************</w:t>
+      </w:r>
+    </w:p>
+    <w:p>
+      <w:pPr>
+        <w:rPr>
+          <w:rFonts w:ascii="Sakkal Majalla" w:hAnsi="Sakkal Majalla" w:cs="Sakkal Majalla"/>
+          <w:sz w:val="28"/>
+          <w:szCs w:val="28"/>
+        </w:rPr>
+      </w:pPr>
+      <w:r>
+        <w:rPr>
+          <w:noProof/>
+        </w:rPr>
+        <w:drawing>
+          <wp:inline distT="0" distB="0" distL="0" distR="0" wp14:anchorId="7BA4FB21" wp14:editId="4990D928">
+            <wp:extent cx="5943600" cy="2894330"/>
+            <wp:effectExtent l="0" t="0" r="0" b="1270"/>
+            <wp:docPr id="1355149572" name="Picture 1"/>
+            <wp:cNvGraphicFramePr>
+              <a:graphicFrameLocks xmlns:a="http://schemas.openxmlformats.org/drawingml/2006/main" noChangeAspect="1"/>
+            </wp:cNvGraphicFramePr>
+            <a:graphic xmlns:a="http://schemas.openxmlformats.org/drawingml/2006/main">
+              <a:graphicData uri="http://schemas.openxmlformats.org/drawingml/2006/picture">
+                <pic:pic xmlns:pic="http://schemas.openxmlformats.org/drawingml/2006/picture">
+                  <pic:nvPicPr>
+                    <pic:cNvPr id="1355149572" name=""/>
+                    <pic:cNvPicPr/>
+                  </pic:nvPicPr>
+                  <pic:blipFill>
+                    <a:blip r:embed="rId17"/>
+                    <a:stretch>
+                      <a:fillRect/>
+                    </a:stretch>
+                  </pic:blipFill>
+                  <pic:spPr>
+                    <a:xfrm>
+                      <a:off x="0" y="0"/>
+                      <a:ext cx="5943600" cy="2894330"/>
+                    </a:xfrm>
+                    <a:prstGeom prst="rect">
+                      <a:avLst/>
+                    </a:prstGeom>
+                  </pic:spPr>
+                </pic:pic>
+              </a:graphicData>
+            </a:graphic>
+          </wp:inline>
+        </w:drawing>
+      </w:r>
+    </w:p>
+    <w:p>
+      <w:pPr>
+        <w:ind w:left="720" w:firstLine="720"/>
+        <w:rPr>
+          <w:rFonts w:ascii="Sakkal Majalla" w:hAnsi="Sakkal Majalla" w:cs="Sakkal Majalla"/>
+          <w:sz w:val="28"/>
+          <w:szCs w:val="28"/>
+        </w:rPr>
+      </w:pPr>
+      <w:r>
+        <w:rPr>
+          <w:rFonts w:ascii="Sakkal Majalla" w:hAnsi="Sakkal Majalla" w:cs="Sakkal Majalla"/>
+          <w:sz w:val="28"/>
+          <w:szCs w:val="28"/>
+        </w:rPr>
+        <w:t>***********************************************************************</w:t>
+      </w:r>
+    </w:p>
+    <w:p>
+      <w:pPr>
+        <w:rPr>
+          <w:rFonts w:ascii="Sakkal Majalla" w:hAnsi="Sakkal Majalla" w:cs="Sakkal Majalla"/>
+          <w:sz w:val="28"/>
+          <w:szCs w:val="28"/>
+        </w:rPr>
+      </w:pPr>
+      <w:r>
+        <w:rPr>
+          <w:noProof/>
+        </w:rPr>
+        <w:lastRenderedPageBreak/>
+        <w:drawing>
+          <wp:inline distT="0" distB="0" distL="0" distR="0" wp14:anchorId="20AC7444" wp14:editId="35CF3F3E">
+            <wp:extent cx="5943600" cy="2786380"/>
+            <wp:effectExtent l="0" t="0" r="0" b="0"/>
+            <wp:docPr id="1944520509" name="Picture 1"/>
+            <wp:cNvGraphicFramePr>
+              <a:graphicFrameLocks xmlns:a="http://schemas.openxmlformats.org/drawingml/2006/main" noChangeAspect="1"/>
+            </wp:cNvGraphicFramePr>
+            <a:graphic xmlns:a="http://schemas.openxmlformats.org/drawingml/2006/main">
+              <a:graphicData uri="http://schemas.openxmlformats.org/drawingml/2006/picture">
+                <pic:pic xmlns:pic="http://schemas.openxmlformats.org/drawingml/2006/picture">
+                  <pic:nvPicPr>
+                    <pic:cNvPr id="1944520509" name=""/>
+                    <pic:cNvPicPr/>
+                  </pic:nvPicPr>
+                  <pic:blipFill>
+                    <a:blip r:embed="rId18"/>
+                    <a:stretch>
+                      <a:fillRect/>
+                    </a:stretch>
+                  </pic:blipFill>
+                  <pic:spPr>
+                    <a:xfrm>
+                      <a:off x="0" y="0"/>
+                      <a:ext cx="5943600" cy="2786380"/>
+                    </a:xfrm>
+                    <a:prstGeom prst="rect">
+                      <a:avLst/>
+                    </a:prstGeom>
+                  </pic:spPr>
+                </pic:pic>
+              </a:graphicData>
+            </a:graphic>
+          </wp:inline>
+        </w:drawing>
+      </w:r>
+    </w:p>
+    <w:p>
+      <w:pPr>
+        <w:ind w:left="720" w:firstLine="720"/>
+        <w:rPr>
+          <w:rFonts w:ascii="Sakkal Majalla" w:hAnsi="Sakkal Majalla" w:cs="Sakkal Majalla"/>
+          <w:sz w:val="28"/>
+          <w:szCs w:val="28"/>
+        </w:rPr>
+      </w:pPr>
+      <w:r>
+        <w:rPr>
+          <w:rFonts w:ascii="Sakkal Majalla" w:hAnsi="Sakkal Majalla" w:cs="Sakkal Majalla"/>
+          <w:sz w:val="28"/>
+          <w:szCs w:val="28"/>
+        </w:rPr>
+        <w:t>***********************************************************************</w:t>
+      </w:r>
+    </w:p>
+    <w:p>
+      <w:pPr>
+        <w:rPr>
+          <w:rFonts w:ascii="Sakkal Majalla" w:hAnsi="Sakkal Majalla" w:cs="Sakkal Majalla"/>
+          <w:sz w:val="28"/>
+          <w:szCs w:val="28"/>
+        </w:rPr>
+      </w:pPr>
+      <w:r>
+        <w:rPr>
+          <w:noProof/>
+        </w:rPr>
+        <w:drawing>
+          <wp:inline distT="0" distB="0" distL="0" distR="0" wp14:anchorId="6EB2BAB8" wp14:editId="5E41E959">
+            <wp:extent cx="5943600" cy="2289810"/>
+            <wp:effectExtent l="0" t="0" r="0" b="0"/>
+            <wp:docPr id="1603213986" name="Picture 1"/>
+            <wp:cNvGraphicFramePr>
+              <a:graphicFrameLocks xmlns:a="http://schemas.openxmlformats.org/drawingml/2006/main" noChangeAspect="1"/>
+            </wp:cNvGraphicFramePr>
+            <a:graphic xmlns:a="http://schemas.openxmlformats.org/drawingml/2006/main">
+              <a:graphicData uri="http://schemas.openxmlformats.org/drawingml/2006/picture">
+                <pic:pic xmlns:pic="http://schemas.openxmlformats.org/drawingml/2006/picture">
+                  <pic:nvPicPr>
+                    <pic:cNvPr id="1603213986" name=""/>
+                    <pic:cNvPicPr/>
+                  </pic:nvPicPr>
+                  <pic:blipFill>
+                    <a:blip r:embed="rId19"/>
+                    <a:stretch>
+                      <a:fillRect/>
+                    </a:stretch>
+                  </pic:blipFill>
+                  <pic:spPr>
+                    <a:xfrm>
+                      <a:off x="0" y="0"/>
+                      <a:ext cx="5943600" cy="2289810"/>
+                    </a:xfrm>
+                    <a:prstGeom prst="rect">
+                      <a:avLst/>
+                    </a:prstGeom>
+                  </pic:spPr>
+                </pic:pic>
+              </a:graphicData>
+            </a:graphic>
+          </wp:inline>
+        </w:drawing>
+      </w:r>
+    </w:p>
+    <w:p>
+      <w:pPr>
+        <w:ind w:left="720" w:firstLine="720"/>
+        <w:rPr>
+          <w:rFonts w:ascii="Sakkal Majalla" w:hAnsi="Sakkal Majalla" w:cs="Sakkal Majalla"/>
+          <w:sz w:val="28"/>
+          <w:szCs w:val="28"/>
+        </w:rPr>
+      </w:pPr>
+      <w:r>
+        <w:rPr>
+          <w:rFonts w:ascii="Sakkal Majalla" w:hAnsi="Sakkal Majalla" w:cs="Sakkal Majalla"/>
+          <w:sz w:val="28"/>
+          <w:szCs w:val="28"/>
+        </w:rPr>
+        <w:t>***********************************************************************</w:t>
+      </w:r>
+    </w:p>
+    <w:p>
+      <w:pPr>
+        <w:rPr>
+          <w:rFonts w:ascii="Sakkal Majalla" w:hAnsi="Sakkal Majalla" w:cs="Sakkal Majalla"/>
+          <w:sz w:val="28"/>
+          <w:szCs w:val="28"/>
+        </w:rPr>
+      </w:pPr>
+      <w:r>
+        <w:rPr>
+          <w:noProof/>
+        </w:rPr>
+        <w:lastRenderedPageBreak/>
+        <w:drawing>
+          <wp:inline distT="0" distB="0" distL="0" distR="0" wp14:anchorId="0E6C0C33" wp14:editId="5F5BAD1F">
+            <wp:extent cx="6665000" cy="4124325"/>
+            <wp:effectExtent l="0" t="0" r="2540" b="0"/>
+            <wp:docPr id="735047809" name="Picture 1"/>
+            <wp:cNvGraphicFramePr>
+              <a:graphicFrameLocks xmlns:a="http://schemas.openxmlformats.org/drawingml/2006/main" noChangeAspect="1"/>
+            </wp:cNvGraphicFramePr>
+            <a:graphic xmlns:a="http://schemas.openxmlformats.org/drawingml/2006/main">
+              <a:graphicData uri="http://schemas.openxmlformats.org/drawingml/2006/picture">
+                <pic:pic xmlns:pic="http://schemas.openxmlformats.org/drawingml/2006/picture">
+                  <pic:nvPicPr>
+                    <pic:cNvPr id="735047809" name=""/>
+                    <pic:cNvPicPr/>
+                  </pic:nvPicPr>
+                  <pic:blipFill>
+                    <a:blip r:embed="rId20"/>
+                    <a:stretch>
+                      <a:fillRect/>
+                    </a:stretch>
+                  </pic:blipFill>
+                  <pic:spPr>
+                    <a:xfrm>
+                      <a:off x="0" y="0"/>
+                      <a:ext cx="6668463" cy="4126468"/>
+                    </a:xfrm>
+                    <a:prstGeom prst="rect">
+                      <a:avLst/>
+                    </a:prstGeom>
+                  </pic:spPr>
+                </pic:pic>
+              </a:graphicData>
+            </a:graphic>
+          </wp:inline>
+        </w:drawing>
+      </w:r>
+    </w:p>
+    <w:p>
+      <w:pPr>
+        <w:ind w:left="720" w:firstLine="720"/>
+        <w:rPr>
+          <w:rFonts w:ascii="Sakkal Majalla" w:hAnsi="Sakkal Majalla" w:cs="Sakkal Majalla"/>
+          <w:sz w:val="28"/>
+          <w:szCs w:val="28"/>
+        </w:rPr>
+      </w:pPr>
+      <w:r>
+        <w:rPr>
+          <w:rFonts w:ascii="Sakkal Majalla" w:hAnsi="Sakkal Majalla" w:cs="Sakkal Majalla"/>
+          <w:sz w:val="28"/>
+          <w:szCs w:val="28"/>
+        </w:rPr>
+        <w:t>***********************************************************************</w:t>
+      </w:r>
+    </w:p>
+    <w:p>
+      <w:pPr>
+        <w:rPr>
+          <w:rFonts w:ascii="Sakkal Majalla" w:hAnsi="Sakkal Majalla" w:cs="Sakkal Majalla"/>
+          <w:sz w:val="28"/>
+          <w:szCs w:val="28"/>
+        </w:rPr>
+      </w:pPr>
+      <w:r>
+        <w:rPr>
+          <w:noProof/>
+        </w:rPr>
+        <w:lastRenderedPageBreak/>
+        <w:drawing>
+          <wp:inline distT="0" distB="0" distL="0" distR="0" wp14:anchorId="67D42D00" wp14:editId="51CF5408">
+            <wp:extent cx="5638800" cy="5734050"/>
+            <wp:effectExtent l="0" t="0" r="0" b="0"/>
+            <wp:docPr id="704115536" name="Picture 1"/>
+            <wp:cNvGraphicFramePr>
+              <a:graphicFrameLocks xmlns:a="http://schemas.openxmlformats.org/drawingml/2006/main" noChangeAspect="1"/>
+            </wp:cNvGraphicFramePr>
+            <a:graphic xmlns:a="http://schemas.openxmlformats.org/drawingml/2006/main">
+              <a:graphicData uri="http://schemas.openxmlformats.org/drawingml/2006/picture">
+                <pic:pic xmlns:pic="http://schemas.openxmlformats.org/drawingml/2006/picture">
+                  <pic:nvPicPr>
+                    <pic:cNvPr id="704115536" name=""/>
+                    <pic:cNvPicPr/>
+                  </pic:nvPicPr>
+                  <pic:blipFill>
+                    <a:blip r:embed="rId21"/>
+                    <a:stretch>
+                      <a:fillRect/>
+                    </a:stretch>
+                  </pic:blipFill>
+                  <pic:spPr>
+                    <a:xfrm>
+                      <a:off x="0" y="0"/>
+                      <a:ext cx="5638800" cy="5734050"/>
+                    </a:xfrm>
+                    <a:prstGeom prst="rect">
+                      <a:avLst/>
+                    </a:prstGeom>
+                  </pic:spPr>
+                </pic:pic>
+              </a:graphicData>
+            </a:graphic>
+          </wp:inline>
+        </w:drawing>
+      </w:r>
+    </w:p>
+    <w:p>
+      <w:pPr>
+        <w:ind w:left="720" w:firstLine="720"/>
+        <w:rPr>
+          <w:rFonts w:ascii="Sakkal Majalla" w:hAnsi="Sakkal Majalla" w:cs="Sakkal Majalla"/>
+          <w:sz w:val="28"/>
+          <w:szCs w:val="28"/>
+        </w:rPr>
+      </w:pPr>
+      <w:r>
+        <w:rPr>
+          <w:rFonts w:ascii="Sakkal Majalla" w:hAnsi="Sakkal Majalla" w:cs="Sakkal Majalla"/>
+          <w:sz w:val="28"/>
+          <w:szCs w:val="28"/>
+        </w:rPr>
+        <w:t>***********************************************************************</w:t>
+      </w:r>
+    </w:p>
+    <w:p>
+      <w:pPr>
+        <w:rPr>
+          <w:rFonts w:ascii="Sakkal Majalla" w:hAnsi="Sakkal Majalla" w:cs="Sakkal Majalla"/>
+          <w:sz w:val="28"/>
+          <w:szCs w:val="28"/>
+        </w:rPr>
+      </w:pPr>
+      <w:r>
+        <w:rPr>
+          <w:noProof/>
+        </w:rPr>
+        <w:lastRenderedPageBreak/>
+        <w:drawing>
+          <wp:inline distT="0" distB="0" distL="0" distR="0" wp14:anchorId="7F3E60AF" wp14:editId="171017E8">
+            <wp:extent cx="4781550" cy="3581400"/>
+            <wp:effectExtent l="0" t="0" r="0" b="0"/>
+            <wp:docPr id="168297819" name="Picture 1"/>
+            <wp:cNvGraphicFramePr>
+              <a:graphicFrameLocks xmlns:a="http://schemas.openxmlformats.org/drawingml/2006/main" noChangeAspect="1"/>
+            </wp:cNvGraphicFramePr>
+            <a:graphic xmlns:a="http://schemas.openxmlformats.org/drawingml/2006/main">
+              <a:graphicData uri="http://schemas.openxmlformats.org/drawingml/2006/picture">
+                <pic:pic xmlns:pic="http://schemas.openxmlformats.org/drawingml/2006/picture">
+                  <pic:nvPicPr>
+                    <pic:cNvPr id="168297819" name=""/>
+                    <pic:cNvPicPr/>
+                  </pic:nvPicPr>
+                  <pic:blipFill>
+                    <a:blip r:embed="rId22"/>
+                    <a:stretch>
+                      <a:fillRect/>
+                    </a:stretch>
+                  </pic:blipFill>
+                  <pic:spPr>
+                    <a:xfrm>
+                      <a:off x="0" y="0"/>
+                      <a:ext cx="4781550" cy="3581400"/>
+                    </a:xfrm>
+                    <a:prstGeom prst="rect">
+                      <a:avLst/>
+                    </a:prstGeom>
+                  </pic:spPr>
+                </pic:pic>
+              </a:graphicData>
+            </a:graphic>
+          </wp:inline>
+        </w:drawing>
+      </w:r>
     </w:p>
     <w:sectPr>
       <w:pgSz w:w="12240" w:h="15840"/>
@@ -1301,7 +2114,6 @@
   <w:style w:type="character" w:default="1" w:styleId="DefaultParagraphFont">
     <w:name w:val="Default Paragraph Font"/>
     <w:uiPriority w:val="1"/>
-    <w:semiHidden/>
     <w:unhideWhenUsed/>
   </w:style>
   <w:style w:type="table" w:default="1" w:styleId="TableNormal">

</xml_diff>